<commit_message>
Corrige les accents des documents de conception, ajoute le rapport final et les slides
Le cahier des charges et les dossiers de conception visuelle/technique
contenaient des accents corrompus par un outil de correction
automatique (par exemple fonctionnelles devenu fontanelles, React et
Laravel devenus Reacs et Lagrave, serif devenu serf, Roboto devenu
Robot). Les trois documents sont regeneres avec des accents verifies
manuellement.

Ajoute deux nouveaux livrables pour la semaine 6 : un rapport final
avec captures d'ecran commentees de l'application en fonctionnement,
et un support de presentation (slides) avec notes du presentateur,
utilisable pour un enregistrement video.

Co-Authored-By: Claude Sonnet 5 <noreply@anthropic.com>
</commit_message>
<xml_diff>
--- a/docs/01_Cahier_des_charges_SignalAyiti.docx
+++ b/docs/01_Cahier_des_charges_SignalAyiti.docx
@@ -30,7 +30,7 @@
           <w:sz w:val="26"/>
           <w:szCs w:val="26"/>
         </w:rPr>
-        <w:t xml:space="preserve">Plateforme de signalement et de suivi des problemes communautaires</w:t>
+        <w:t xml:space="preserve">Plateforme de signalement et de suivi des problèmes communautaires</w:t>
       </w:r>
     </w:p>
     <w:p>
@@ -64,7 +64,7 @@
           <w:sz w:val="20"/>
           <w:szCs w:val="20"/>
         </w:rPr>
-        <w:t xml:space="preserve">Cours Developpement Web, niveau approfondi. Projet individuel React + Laravel.</w:t>
+        <w:t xml:space="preserve">Cours Développement Web, niveau approfondi. Projet individuel React + Laravel.</w:t>
       </w:r>
     </w:p>
     <w:p>
@@ -81,7 +81,7 @@
         <w:spacing w:after="120"/>
       </w:pPr>
       <w:r>
-        <w:t xml:space="preserve">Ce document definit les specifications fonctionnelles, techniques et les exigences generales pour le developpement de l'application web SignalAyiti. Cette application a pour but de faciliter le signalement et le suivi des problemes rencontres au quotidien dans les quartiers et communes d'Haiti : routes endommagees, pannes d'eau potable, coupures d'electricite, dechets non ramasses, eclairage public defaillant et incidents de securite.</w:t>
+        <w:t xml:space="preserve">Ce document définit les spécifications fonctionnelles, techniques et les exigences générales pour le développement de l'application web SignalAyiti. Cette application a pour but de faciliter le signalement et le suivi des problèmes rencontrés au quotidien dans les quartiers et communes d'Haïti : routes endommagées, pannes d'eau potable, coupures d'électricité, déchets non ramassés, éclairage public défaillant et incidents de sécurité.</w:t>
       </w:r>
     </w:p>
     <w:p>
@@ -89,7 +89,7 @@
         <w:spacing w:after="120"/>
       </w:pPr>
       <w:r>
-        <w:t xml:space="preserve">Elle s'adresse a deux types d'utilisateurs : les citoyens qui souhaitent signaler un probleme observe dans leur quartier, et les agents communaux charges de traiter ces signalements et d'en assurer le suivi. L'application sera developpee avec React pour la partie front-end (interface utilisateur) et Laravel pour la partie back-end (API et gestion des donnees).</w:t>
+        <w:t xml:space="preserve">Elle s'adresse à deux types d'utilisateurs : les citoyens qui souhaitent signaler un problème observé dans leur quartier, et les agents communaux chargés de traiter ces signalements et d'en assurer le suivi. L'application sera développée avec React pour la partie front-end (interface utilisateur) et Laravel pour la partie back-end (API et gestion des données).</w:t>
       </w:r>
     </w:p>
     <w:p>
@@ -111,59 +111,59 @@
         <w:spacing w:after="60"/>
       </w:pPr>
       <w:r>
-        <w:t xml:space="preserve">Offrir aux citoyens un moyen simple et rapide de signaler un probleme communautaire, y compris avec une connexion internet limitee.</w:t>
-      </w:r>
-    </w:p>
-    <w:p>
-      <w:pPr>
-        <w:pStyle w:val="ListParagraph"/>
-        <w:numPr>
-          <w:ilvl w:val="0"/>
-          <w:numId w:val="2"/>
-        </w:numPr>
-        <w:spacing w:after="60"/>
-      </w:pPr>
-      <w:r>
-        <w:t xml:space="preserve">Permettre aux agents communaux de centraliser, prioriser et suivre le traitement des signalements recus.</w:t>
-      </w:r>
-    </w:p>
-    <w:p>
-      <w:pPr>
-        <w:pStyle w:val="ListParagraph"/>
-        <w:numPr>
-          <w:ilvl w:val="0"/>
-          <w:numId w:val="2"/>
-        </w:numPr>
-        <w:spacing w:after="60"/>
-      </w:pPr>
-      <w:r>
-        <w:t xml:space="preserve">Donner de la visibilite aux citoyens sur le statut de leur signalement et sur les interventions realisees, afin de renforcer la confiance envers les services de la commune.</w:t>
-      </w:r>
-    </w:p>
-    <w:p>
-      <w:pPr>
-        <w:pStyle w:val="ListParagraph"/>
-        <w:numPr>
-          <w:ilvl w:val="0"/>
-          <w:numId w:val="2"/>
-        </w:numPr>
-        <w:spacing w:after="60"/>
-      </w:pPr>
-      <w:r>
-        <w:t xml:space="preserve">Fournir un tableau de bord simple presentant une vue d'ensemble de la situation par statut, par categorie et par quartier.</w:t>
-      </w:r>
-    </w:p>
-    <w:p>
-      <w:pPr>
-        <w:pStyle w:val="ListParagraph"/>
-        <w:numPr>
-          <w:ilvl w:val="0"/>
-          <w:numId w:val="2"/>
-        </w:numPr>
-        <w:spacing w:after="60"/>
-      </w:pPr>
-      <w:r>
-        <w:t xml:space="preserve">Mettre en pratique, dans le cadre du cours, l'integration complete d'une application React et Laravel : authentification, operations CRUD, notifications, tests et securite.</w:t>
+        <w:t xml:space="preserve">Offrir aux citoyens un moyen simple et rapide de signaler un problème communautaire, y compris avec une connexion internet limitée.</w:t>
+      </w:r>
+    </w:p>
+    <w:p>
+      <w:pPr>
+        <w:pStyle w:val="ListParagraph"/>
+        <w:numPr>
+          <w:ilvl w:val="0"/>
+          <w:numId w:val="2"/>
+        </w:numPr>
+        <w:spacing w:after="60"/>
+      </w:pPr>
+      <w:r>
+        <w:t xml:space="preserve">Permettre aux agents communaux de centraliser, prioriser et suivre le traitement des signalements reçus.</w:t>
+      </w:r>
+    </w:p>
+    <w:p>
+      <w:pPr>
+        <w:pStyle w:val="ListParagraph"/>
+        <w:numPr>
+          <w:ilvl w:val="0"/>
+          <w:numId w:val="2"/>
+        </w:numPr>
+        <w:spacing w:after="60"/>
+      </w:pPr>
+      <w:r>
+        <w:t xml:space="preserve">Donner de la visibilité aux citoyens sur le statut de leur signalement et sur les interventions réalisées, afin de renforcer la confiance envers les services de la commune.</w:t>
+      </w:r>
+    </w:p>
+    <w:p>
+      <w:pPr>
+        <w:pStyle w:val="ListParagraph"/>
+        <w:numPr>
+          <w:ilvl w:val="0"/>
+          <w:numId w:val="2"/>
+        </w:numPr>
+        <w:spacing w:after="60"/>
+      </w:pPr>
+      <w:r>
+        <w:t xml:space="preserve">Fournir un tableau de bord simple présentant une vue d'ensemble de la situation par statut, par catégorie et par quartier.</w:t>
+      </w:r>
+    </w:p>
+    <w:p>
+      <w:pPr>
+        <w:pStyle w:val="ListParagraph"/>
+        <w:numPr>
+          <w:ilvl w:val="0"/>
+          <w:numId w:val="2"/>
+        </w:numPr>
+        <w:spacing w:after="60"/>
+      </w:pPr>
+      <w:r>
+        <w:t xml:space="preserve">Mettre en pratique, dans le cadre du cours, l'intégration complète d'une application React et Laravel : authentification, opérations CRUD, notifications, tests et sécurité.</w:t>
       </w:r>
     </w:p>
     <w:p>
@@ -172,7 +172,7 @@
         <w:spacing w:after="150" w:before="300"/>
       </w:pPr>
       <w:r>
-        <w:t xml:space="preserve">3. Portee du projet</w:t>
+        <w:t xml:space="preserve">3. Portée du projet</w:t>
       </w:r>
     </w:p>
     <w:p>
@@ -181,7 +181,7 @@
         <w:spacing w:after="100" w:before="200"/>
       </w:pPr>
       <w:r>
-        <w:t xml:space="preserve">Fonctionnalites incluses dans la version livree (2 semaines)</w:t>
+        <w:t xml:space="preserve">Fonctionnalités incluses dans la version livrée (2 semaines)</w:t>
       </w:r>
     </w:p>
     <w:p>
@@ -207,33 +207,33 @@
         <w:spacing w:after="60"/>
       </w:pPr>
       <w:r>
-        <w:t xml:space="preserve">Creation d'un signalement par un citoyen : categorie, titre, description, quartier, photo facultative.</w:t>
-      </w:r>
-    </w:p>
-    <w:p>
-      <w:pPr>
-        <w:pStyle w:val="ListParagraph"/>
-        <w:numPr>
-          <w:ilvl w:val="0"/>
-          <w:numId w:val="2"/>
-        </w:numPr>
-        <w:spacing w:after="60"/>
-      </w:pPr>
-      <w:r>
-        <w:t xml:space="preserve">Suivi du statut d'un signalement (nouveau, en cours, resolu, rejete) avec historique des interventions.</w:t>
-      </w:r>
-    </w:p>
-    <w:p>
-      <w:pPr>
-        <w:pStyle w:val="ListParagraph"/>
-        <w:numPr>
-          <w:ilvl w:val="0"/>
-          <w:numId w:val="2"/>
-        </w:numPr>
-        <w:spacing w:after="60"/>
-      </w:pPr>
-      <w:r>
-        <w:t xml:space="preserve">Ajout d'interventions par un agent : changement de statut accompagne d'un commentaire.</w:t>
+        <w:t xml:space="preserve">Création d'un signalement par un citoyen : catégorie, titre, description, quartier, photo facultative.</w:t>
+      </w:r>
+    </w:p>
+    <w:p>
+      <w:pPr>
+        <w:pStyle w:val="ListParagraph"/>
+        <w:numPr>
+          <w:ilvl w:val="0"/>
+          <w:numId w:val="2"/>
+        </w:numPr>
+        <w:spacing w:after="60"/>
+      </w:pPr>
+      <w:r>
+        <w:t xml:space="preserve">Suivi du statut d'un signalement (nouveau, en cours, résolu, rejeté) avec historique des interventions.</w:t>
+      </w:r>
+    </w:p>
+    <w:p>
+      <w:pPr>
+        <w:pStyle w:val="ListParagraph"/>
+        <w:numPr>
+          <w:ilvl w:val="0"/>
+          <w:numId w:val="2"/>
+        </w:numPr>
+        <w:spacing w:after="60"/>
+      </w:pPr>
+      <w:r>
+        <w:t xml:space="preserve">Ajout d'interventions par un agent : changement de statut accompagné d'un commentaire.</w:t>
       </w:r>
     </w:p>
     <w:p>
@@ -259,7 +259,7 @@
         <w:spacing w:after="60"/>
       </w:pPr>
       <w:r>
-        <w:t xml:space="preserve">Tableau de bord de statistiques a destination des agents.</w:t>
+        <w:t xml:space="preserve">Tableau de bord de statistiques à destination des agents.</w:t>
       </w:r>
     </w:p>
     <w:p>
@@ -268,20 +268,20 @@
         <w:spacing w:after="100" w:before="200"/>
       </w:pPr>
       <w:r>
-        <w:t xml:space="preserve">Fonctionnalites envisagees mais reportees a une version future</w:t>
-      </w:r>
-    </w:p>
-    <w:p>
-      <w:pPr>
-        <w:pStyle w:val="ListParagraph"/>
-        <w:numPr>
-          <w:ilvl w:val="0"/>
-          <w:numId w:val="2"/>
-        </w:numPr>
-        <w:spacing w:after="60"/>
-      </w:pPr>
-      <w:r>
-        <w:t xml:space="preserve">Carte interactive avec geolocalisation precise par coordonnees GPS.</w:t>
+        <w:t xml:space="preserve">Fonctionnalités envisagées mais reportées à une version future</w:t>
+      </w:r>
+    </w:p>
+    <w:p>
+      <w:pPr>
+        <w:pStyle w:val="ListParagraph"/>
+        <w:numPr>
+          <w:ilvl w:val="0"/>
+          <w:numId w:val="2"/>
+        </w:numPr>
+        <w:spacing w:after="60"/>
+      </w:pPr>
+      <w:r>
+        <w:t xml:space="preserve">Carte interactive avec géolocalisation précise par coordonnées GPS.</w:t>
       </w:r>
     </w:p>
     <w:p>
@@ -320,7 +320,7 @@
         <w:spacing w:after="60"/>
       </w:pPr>
       <w:r>
-        <w:t xml:space="preserve">Interface disponible integralement en creole haitien, en plus du francais.</w:t>
+        <w:t xml:space="preserve">Interface disponible intégralement en créole haïtien, en plus du français.</w:t>
       </w:r>
     </w:p>
     <w:p>
@@ -342,20 +342,20 @@
         <w:spacing w:after="100" w:before="200"/>
       </w:pPr>
       <w:r>
-        <w:t xml:space="preserve">Utilisateurs et roles</w:t>
-      </w:r>
-    </w:p>
-    <w:p>
-      <w:pPr>
-        <w:pStyle w:val="ListParagraph"/>
-        <w:numPr>
-          <w:ilvl w:val="0"/>
-          <w:numId w:val="2"/>
-        </w:numPr>
-        <w:spacing w:after="60"/>
-      </w:pPr>
-      <w:r>
-        <w:t xml:space="preserve">Citoyen : cree un compte, signale un incident, consulte ses propres signalements et recoit des notifications.</w:t>
+        <w:t xml:space="preserve">Utilisateurs et rôles</w:t>
+      </w:r>
+    </w:p>
+    <w:p>
+      <w:pPr>
+        <w:pStyle w:val="ListParagraph"/>
+        <w:numPr>
+          <w:ilvl w:val="0"/>
+          <w:numId w:val="2"/>
+        </w:numPr>
+        <w:spacing w:after="60"/>
+      </w:pPr>
+      <w:r>
+        <w:t xml:space="preserve">Citoyen : crée un compte, signale un incident, consulte ses propres signalements et reçoit des notifications.</w:t>
       </w:r>
     </w:p>
     <w:p>
@@ -377,20 +377,20 @@
         <w:spacing w:after="100" w:before="200"/>
       </w:pPr>
       <w:r>
-        <w:t xml:space="preserve">Criteres de reussite du projet</w:t>
-      </w:r>
-    </w:p>
-    <w:p>
-      <w:pPr>
-        <w:pStyle w:val="ListParagraph"/>
-        <w:numPr>
-          <w:ilvl w:val="0"/>
-          <w:numId w:val="2"/>
-        </w:numPr>
-        <w:spacing w:after="60"/>
-      </w:pPr>
-      <w:r>
-        <w:t xml:space="preserve">Un citoyen peut creer un compte, signaler un incident et voir son statut evoluer dans le temps.</w:t>
+        <w:t xml:space="preserve">Critères de réussite du projet</w:t>
+      </w:r>
+    </w:p>
+    <w:p>
+      <w:pPr>
+        <w:pStyle w:val="ListParagraph"/>
+        <w:numPr>
+          <w:ilvl w:val="0"/>
+          <w:numId w:val="2"/>
+        </w:numPr>
+        <w:spacing w:after="60"/>
+      </w:pPr>
+      <w:r>
+        <w:t xml:space="preserve">Un citoyen peut créer un compte, signaler un incident et voir son statut évoluer dans le temps.</w:t>
       </w:r>
     </w:p>
     <w:p>
@@ -416,20 +416,20 @@
         <w:spacing w:after="60"/>
       </w:pPr>
       <w:r>
-        <w:t xml:space="preserve">Le citoyen est notifie a chaque changement de statut de son signalement.</w:t>
-      </w:r>
-    </w:p>
-    <w:p>
-      <w:pPr>
-        <w:pStyle w:val="ListParagraph"/>
-        <w:numPr>
-          <w:ilvl w:val="0"/>
-          <w:numId w:val="2"/>
-        </w:numPr>
-        <w:spacing w:after="60"/>
-      </w:pPr>
-      <w:r>
-        <w:t xml:space="preserve">L'application fonctionne de maniere fluide sur mobile et sur ordinateur, avec un temps de chargement raisonnable.</w:t>
+        <w:t xml:space="preserve">Le citoyen est notifié à chaque changement de statut de son signalement.</w:t>
+      </w:r>
+    </w:p>
+    <w:p>
+      <w:pPr>
+        <w:pStyle w:val="ListParagraph"/>
+        <w:numPr>
+          <w:ilvl w:val="0"/>
+          <w:numId w:val="2"/>
+        </w:numPr>
+        <w:spacing w:after="60"/>
+      </w:pPr>
+      <w:r>
+        <w:t xml:space="preserve">L'application fonctionne de manière fluide sur mobile et sur ordinateur, avec un temps de chargement raisonnable.</w:t>
       </w:r>
     </w:p>
     <w:p>
@@ -460,33 +460,33 @@
         <w:spacing w:after="60"/>
       </w:pPr>
       <w:r>
-        <w:t xml:space="preserve">Inscription avec nom, email, mot de passe, quartier de residence et role (citoyen par defaut).</w:t>
-      </w:r>
-    </w:p>
-    <w:p>
-      <w:pPr>
-        <w:pStyle w:val="ListParagraph"/>
-        <w:numPr>
-          <w:ilvl w:val="0"/>
-          <w:numId w:val="2"/>
-        </w:numPr>
-        <w:spacing w:after="60"/>
-      </w:pPr>
-      <w:r>
-        <w:t xml:space="preserve">Connexion et deconnexion securisees.</w:t>
-      </w:r>
-    </w:p>
-    <w:p>
-      <w:pPr>
-        <w:pStyle w:val="ListParagraph"/>
-        <w:numPr>
-          <w:ilvl w:val="0"/>
-          <w:numId w:val="2"/>
-        </w:numPr>
-        <w:spacing w:after="60"/>
-      </w:pPr>
-      <w:r>
-        <w:t xml:space="preserve">Consultation des informations du compte connecte.</w:t>
+        <w:t xml:space="preserve">Inscription avec nom, email, mot de passe, quartier de résidence et rôle (citoyen par défaut).</w:t>
+      </w:r>
+    </w:p>
+    <w:p>
+      <w:pPr>
+        <w:pStyle w:val="ListParagraph"/>
+        <w:numPr>
+          <w:ilvl w:val="0"/>
+          <w:numId w:val="2"/>
+        </w:numPr>
+        <w:spacing w:after="60"/>
+      </w:pPr>
+      <w:r>
+        <w:t xml:space="preserve">Connexion et déconnexion sécurisées.</w:t>
+      </w:r>
+    </w:p>
+    <w:p>
+      <w:pPr>
+        <w:pStyle w:val="ListParagraph"/>
+        <w:numPr>
+          <w:ilvl w:val="0"/>
+          <w:numId w:val="2"/>
+        </w:numPr>
+        <w:spacing w:after="60"/>
+      </w:pPr>
+      <w:r>
+        <w:t xml:space="preserve">Consultation des informations du compte connecté.</w:t>
       </w:r>
     </w:p>
     <w:p>
@@ -508,33 +508,33 @@
         <w:spacing w:after="60"/>
       </w:pPr>
       <w:r>
-        <w:t xml:space="preserve">Un citoyen peut creer un signalement avec categorie, titre, description, quartier et une photo facultative.</w:t>
-      </w:r>
-    </w:p>
-    <w:p>
-      <w:pPr>
-        <w:pStyle w:val="ListParagraph"/>
-        <w:numPr>
-          <w:ilvl w:val="0"/>
-          <w:numId w:val="2"/>
-        </w:numPr>
-        <w:spacing w:after="60"/>
-      </w:pPr>
-      <w:r>
-        <w:t xml:space="preserve">Un citoyen peut consulter la liste de ses propres signalements et le detail de chacun.</w:t>
-      </w:r>
-    </w:p>
-    <w:p>
-      <w:pPr>
-        <w:pStyle w:val="ListParagraph"/>
-        <w:numPr>
-          <w:ilvl w:val="0"/>
-          <w:numId w:val="2"/>
-        </w:numPr>
-        <w:spacing w:after="60"/>
-      </w:pPr>
-      <w:r>
-        <w:t xml:space="preserve">Un agent peut consulter la liste de tous les signalements, avec des filtres par statut, categorie et quartier.</w:t>
+        <w:t xml:space="preserve">Un citoyen peut créer un signalement avec catégorie, titre, description, quartier et une photo facultative.</w:t>
+      </w:r>
+    </w:p>
+    <w:p>
+      <w:pPr>
+        <w:pStyle w:val="ListParagraph"/>
+        <w:numPr>
+          <w:ilvl w:val="0"/>
+          <w:numId w:val="2"/>
+        </w:numPr>
+        <w:spacing w:after="60"/>
+      </w:pPr>
+      <w:r>
+        <w:t xml:space="preserve">Un citoyen peut consulter la liste de ses propres signalements et le détail de chacun.</w:t>
+      </w:r>
+    </w:p>
+    <w:p>
+      <w:pPr>
+        <w:pStyle w:val="ListParagraph"/>
+        <w:numPr>
+          <w:ilvl w:val="0"/>
+          <w:numId w:val="2"/>
+        </w:numPr>
+        <w:spacing w:after="60"/>
+      </w:pPr>
+      <w:r>
+        <w:t xml:space="preserve">Un agent peut consulter la liste de tous les signalements, avec des filtres par statut, catégorie et quartier.</w:t>
       </w:r>
     </w:p>
     <w:p>
@@ -560,7 +560,7 @@
         <w:spacing w:after="60"/>
       </w:pPr>
       <w:r>
-        <w:t xml:space="preserve">Un citoyen peut supprimer un signalement tant qu'il n'a pas encore ete pris en charge par un agent.</w:t>
+        <w:t xml:space="preserve">Un citoyen peut supprimer un signalement tant qu'il n'a pas encore été pris en charge par un agent.</w:t>
       </w:r>
     </w:p>
     <w:p>
@@ -595,7 +595,7 @@
         <w:spacing w:after="60"/>
       </w:pPr>
       <w:r>
-        <w:t xml:space="preserve">Le citoyen consulte cet historique directement sur la page de detail de son signalement.</w:t>
+        <w:t xml:space="preserve">Le citoyen consulte cet historique directement sur la page de détail de son signalement.</w:t>
       </w:r>
     </w:p>
     <w:p>
@@ -617,7 +617,7 @@
         <w:spacing w:after="60"/>
       </w:pPr>
       <w:r>
-        <w:t xml:space="preserve">Une notification est creee automatiquement pour le citoyen des que le statut de son signalement change.</w:t>
+        <w:t xml:space="preserve">Une notification est créée automatiquement pour le citoyen dès que le statut de son signalement change.</w:t>
       </w:r>
     </w:p>
     <w:p>
@@ -652,7 +652,7 @@
         <w:spacing w:after="60"/>
       </w:pPr>
       <w:r>
-        <w:t xml:space="preserve">L'agent consulte un tableau de bord presentant le nombre de signalements par statut, par categorie et par quartier.</w:t>
+        <w:t xml:space="preserve">L'agent consulte un tableau de bord présentant le nombre de signalements par statut, par catégorie et par quartier.</w:t>
       </w:r>
     </w:p>
     <w:p>
@@ -661,7 +661,7 @@
         <w:spacing w:after="150" w:before="300"/>
       </w:pPr>
       <w:r>
-        <w:t xml:space="preserve">5. Modele de donnees / structure des donnees</w:t>
+        <w:t xml:space="preserve">5. Modèle de données / structure des données</w:t>
       </w:r>
     </w:p>
     <w:p>
@@ -669,7 +669,7 @@
         <w:spacing w:after="120"/>
       </w:pPr>
       <w:r>
-        <w:t xml:space="preserve">Quatre entites principales composent le modele de donnees de l'application.</w:t>
+        <w:t xml:space="preserve">Quatre entités principales composent le modèle de données de l'application.</w:t>
       </w:r>
     </w:p>
     <w:p>
@@ -708,9 +708,6 @@
             <w:shd w:fill="D9E2F3" w:val="clear"/>
           </w:tcPr>
           <w:p>
-            <w:pPr>
-              <w:jc w:val="left"/>
-            </w:pPr>
             <w:r>
               <w:rPr>
                 <w:b/>
@@ -726,9 +723,6 @@
             <w:shd w:fill="D9E2F3" w:val="clear"/>
           </w:tcPr>
           <w:p>
-            <w:pPr>
-              <w:jc w:val="left"/>
-            </w:pPr>
             <w:r>
               <w:rPr>
                 <w:b/>
@@ -744,9 +738,6 @@
             <w:shd w:fill="D9E2F3" w:val="clear"/>
           </w:tcPr>
           <w:p>
-            <w:pPr>
-              <w:jc w:val="left"/>
-            </w:pPr>
             <w:r>
               <w:rPr>
                 <w:b/>
@@ -763,9 +754,6 @@
             <w:tcW w:type="dxa" w:w="3000"/>
           </w:tcPr>
           <w:p>
-            <w:pPr>
-              <w:jc w:val="left"/>
-            </w:pPr>
             <w:r>
               <w:rPr>
                 <w:b w:val="false"/>
@@ -780,9 +768,6 @@
             <w:tcW w:type="dxa" w:w="2500"/>
           </w:tcPr>
           <w:p>
-            <w:pPr>
-              <w:jc w:val="left"/>
-            </w:pPr>
             <w:r>
               <w:rPr>
                 <w:b w:val="false"/>
@@ -797,9 +782,6 @@
             <w:tcW w:type="dxa" w:w="5300"/>
           </w:tcPr>
           <w:p>
-            <w:pPr>
-              <w:jc w:val="left"/>
-            </w:pPr>
             <w:r>
               <w:rPr>
                 <w:b w:val="false"/>
@@ -816,9 +798,6 @@
             <w:tcW w:type="dxa" w:w="3000"/>
           </w:tcPr>
           <w:p>
-            <w:pPr>
-              <w:jc w:val="left"/>
-            </w:pPr>
             <w:r>
               <w:rPr>
                 <w:b w:val="false"/>
@@ -833,9 +812,6 @@
             <w:tcW w:type="dxa" w:w="2500"/>
           </w:tcPr>
           <w:p>
-            <w:pPr>
-              <w:jc w:val="left"/>
-            </w:pPr>
             <w:r>
               <w:rPr>
                 <w:b w:val="false"/>
@@ -850,15 +826,12 @@
             <w:tcW w:type="dxa" w:w="5300"/>
           </w:tcPr>
           <w:p>
-            <w:pPr>
-              <w:jc w:val="left"/>
-            </w:pPr>
-            <w:r>
-              <w:rPr>
-                <w:b w:val="false"/>
-                <w:bCs w:val="false"/>
-              </w:rPr>
-              <w:t xml:space="preserve">Adresse email, utilisee pour la connexion</w:t>
+            <w:r>
+              <w:rPr>
+                <w:b w:val="false"/>
+                <w:bCs w:val="false"/>
+              </w:rPr>
+              <w:t xml:space="preserve">Adresse email, utilisée pour la connexion</w:t>
             </w:r>
           </w:p>
         </w:tc>
@@ -869,9 +842,6 @@
             <w:tcW w:type="dxa" w:w="3000"/>
           </w:tcPr>
           <w:p>
-            <w:pPr>
-              <w:jc w:val="left"/>
-            </w:pPr>
             <w:r>
               <w:rPr>
                 <w:b w:val="false"/>
@@ -886,9 +856,6 @@
             <w:tcW w:type="dxa" w:w="2500"/>
           </w:tcPr>
           <w:p>
-            <w:pPr>
-              <w:jc w:val="left"/>
-            </w:pPr>
             <w:r>
               <w:rPr>
                 <w:b w:val="false"/>
@@ -903,15 +870,12 @@
             <w:tcW w:type="dxa" w:w="5300"/>
           </w:tcPr>
           <w:p>
-            <w:pPr>
-              <w:jc w:val="left"/>
-            </w:pPr>
-            <w:r>
-              <w:rPr>
-                <w:b w:val="false"/>
-                <w:bCs w:val="false"/>
-              </w:rPr>
-              <w:t xml:space="preserve">Mot de passe hache</w:t>
+            <w:r>
+              <w:rPr>
+                <w:b w:val="false"/>
+                <w:bCs w:val="false"/>
+              </w:rPr>
+              <w:t xml:space="preserve">Mot de passe haché</w:t>
             </w:r>
           </w:p>
         </w:tc>
@@ -922,9 +886,6 @@
             <w:tcW w:type="dxa" w:w="3000"/>
           </w:tcPr>
           <w:p>
-            <w:pPr>
-              <w:jc w:val="left"/>
-            </w:pPr>
             <w:r>
               <w:rPr>
                 <w:b w:val="false"/>
@@ -939,9 +900,6 @@
             <w:tcW w:type="dxa" w:w="2500"/>
           </w:tcPr>
           <w:p>
-            <w:pPr>
-              <w:jc w:val="left"/>
-            </w:pPr>
             <w:r>
               <w:rPr>
                 <w:b w:val="false"/>
@@ -956,9 +914,6 @@
             <w:tcW w:type="dxa" w:w="5300"/>
           </w:tcPr>
           <w:p>
-            <w:pPr>
-              <w:jc w:val="left"/>
-            </w:pPr>
             <w:r>
               <w:rPr>
                 <w:b w:val="false"/>
@@ -975,9 +930,6 @@
             <w:tcW w:type="dxa" w:w="3000"/>
           </w:tcPr>
           <w:p>
-            <w:pPr>
-              <w:jc w:val="left"/>
-            </w:pPr>
             <w:r>
               <w:rPr>
                 <w:b w:val="false"/>
@@ -992,9 +944,6 @@
             <w:tcW w:type="dxa" w:w="2500"/>
           </w:tcPr>
           <w:p>
-            <w:pPr>
-              <w:jc w:val="left"/>
-            </w:pPr>
             <w:r>
               <w:rPr>
                 <w:b w:val="false"/>
@@ -1009,15 +958,12 @@
             <w:tcW w:type="dxa" w:w="5300"/>
           </w:tcPr>
           <w:p>
-            <w:pPr>
-              <w:jc w:val="left"/>
-            </w:pPr>
-            <w:r>
-              <w:rPr>
-                <w:b w:val="false"/>
-                <w:bCs w:val="false"/>
-              </w:rPr>
-              <w:t xml:space="preserve">Quartier ou commune de residence</w:t>
+            <w:r>
+              <w:rPr>
+                <w:b w:val="false"/>
+                <w:bCs w:val="false"/>
+              </w:rPr>
+              <w:t xml:space="preserve">Quartier ou commune de résidence</w:t>
             </w:r>
           </w:p>
         </w:tc>
@@ -1028,9 +974,6 @@
             <w:tcW w:type="dxa" w:w="3000"/>
           </w:tcPr>
           <w:p>
-            <w:pPr>
-              <w:jc w:val="left"/>
-            </w:pPr>
             <w:r>
               <w:rPr>
                 <w:b w:val="false"/>
@@ -1045,9 +988,6 @@
             <w:tcW w:type="dxa" w:w="2500"/>
           </w:tcPr>
           <w:p>
-            <w:pPr>
-              <w:jc w:val="left"/>
-            </w:pPr>
             <w:r>
               <w:rPr>
                 <w:b w:val="false"/>
@@ -1062,15 +1002,12 @@
             <w:tcW w:type="dxa" w:w="5300"/>
           </w:tcPr>
           <w:p>
-            <w:pPr>
-              <w:jc w:val="left"/>
-            </w:pPr>
-            <w:r>
-              <w:rPr>
-                <w:b w:val="false"/>
-                <w:bCs w:val="false"/>
-              </w:rPr>
-              <w:t xml:space="preserve">Numero de telephone de contact</w:t>
+            <w:r>
+              <w:rPr>
+                <w:b w:val="false"/>
+                <w:bCs w:val="false"/>
+              </w:rPr>
+              <w:t xml:space="preserve">Numéro de téléphone de contact</w:t>
             </w:r>
           </w:p>
         </w:tc>
@@ -1112,9 +1049,6 @@
             <w:shd w:fill="D9E2F3" w:val="clear"/>
           </w:tcPr>
           <w:p>
-            <w:pPr>
-              <w:jc w:val="left"/>
-            </w:pPr>
             <w:r>
               <w:rPr>
                 <w:b/>
@@ -1130,9 +1064,6 @@
             <w:shd w:fill="D9E2F3" w:val="clear"/>
           </w:tcPr>
           <w:p>
-            <w:pPr>
-              <w:jc w:val="left"/>
-            </w:pPr>
             <w:r>
               <w:rPr>
                 <w:b/>
@@ -1148,9 +1079,6 @@
             <w:shd w:fill="D9E2F3" w:val="clear"/>
           </w:tcPr>
           <w:p>
-            <w:pPr>
-              <w:jc w:val="left"/>
-            </w:pPr>
             <w:r>
               <w:rPr>
                 <w:b/>
@@ -1167,9 +1095,6 @@
             <w:tcW w:type="dxa" w:w="3000"/>
           </w:tcPr>
           <w:p>
-            <w:pPr>
-              <w:jc w:val="left"/>
-            </w:pPr>
             <w:r>
               <w:rPr>
                 <w:b w:val="false"/>
@@ -1184,9 +1109,6 @@
             <w:tcW w:type="dxa" w:w="2500"/>
           </w:tcPr>
           <w:p>
-            <w:pPr>
-              <w:jc w:val="left"/>
-            </w:pPr>
             <w:r>
               <w:rPr>
                 <w:b w:val="false"/>
@@ -1201,15 +1123,12 @@
             <w:tcW w:type="dxa" w:w="5300"/>
           </w:tcPr>
           <w:p>
-            <w:pPr>
-              <w:jc w:val="left"/>
-            </w:pPr>
-            <w:r>
-              <w:rPr>
-                <w:b w:val="false"/>
-                <w:bCs w:val="false"/>
-              </w:rPr>
-              <w:t xml:space="preserve">Citoyen ayant cree le signalement</w:t>
+            <w:r>
+              <w:rPr>
+                <w:b w:val="false"/>
+                <w:bCs w:val="false"/>
+              </w:rPr>
+              <w:t xml:space="preserve">Citoyen ayant créé le signalement</w:t>
             </w:r>
           </w:p>
         </w:tc>
@@ -1220,9 +1139,6 @@
             <w:tcW w:type="dxa" w:w="3000"/>
           </w:tcPr>
           <w:p>
-            <w:pPr>
-              <w:jc w:val="left"/>
-            </w:pPr>
             <w:r>
               <w:rPr>
                 <w:b w:val="false"/>
@@ -1237,9 +1153,6 @@
             <w:tcW w:type="dxa" w:w="2500"/>
           </w:tcPr>
           <w:p>
-            <w:pPr>
-              <w:jc w:val="left"/>
-            </w:pPr>
             <w:r>
               <w:rPr>
                 <w:b w:val="false"/>
@@ -1254,9 +1167,6 @@
             <w:tcW w:type="dxa" w:w="5300"/>
           </w:tcPr>
           <w:p>
-            <w:pPr>
-              <w:jc w:val="left"/>
-            </w:pPr>
             <w:r>
               <w:rPr>
                 <w:b w:val="false"/>
@@ -1273,9 +1183,6 @@
             <w:tcW w:type="dxa" w:w="3000"/>
           </w:tcPr>
           <w:p>
-            <w:pPr>
-              <w:jc w:val="left"/>
-            </w:pPr>
             <w:r>
               <w:rPr>
                 <w:b w:val="false"/>
@@ -1290,9 +1197,6 @@
             <w:tcW w:type="dxa" w:w="2500"/>
           </w:tcPr>
           <w:p>
-            <w:pPr>
-              <w:jc w:val="left"/>
-            </w:pPr>
             <w:r>
               <w:rPr>
                 <w:b w:val="false"/>
@@ -1307,9 +1211,6 @@
             <w:tcW w:type="dxa" w:w="5300"/>
           </w:tcPr>
           <w:p>
-            <w:pPr>
-              <w:jc w:val="left"/>
-            </w:pPr>
             <w:r>
               <w:rPr>
                 <w:b w:val="false"/>
@@ -1326,9 +1227,6 @@
             <w:tcW w:type="dxa" w:w="3000"/>
           </w:tcPr>
           <w:p>
-            <w:pPr>
-              <w:jc w:val="left"/>
-            </w:pPr>
             <w:r>
               <w:rPr>
                 <w:b w:val="false"/>
@@ -1343,9 +1241,6 @@
             <w:tcW w:type="dxa" w:w="2500"/>
           </w:tcPr>
           <w:p>
-            <w:pPr>
-              <w:jc w:val="left"/>
-            </w:pPr>
             <w:r>
               <w:rPr>
                 <w:b w:val="false"/>
@@ -1360,15 +1255,12 @@
             <w:tcW w:type="dxa" w:w="5300"/>
           </w:tcPr>
           <w:p>
-            <w:pPr>
-              <w:jc w:val="left"/>
-            </w:pPr>
-            <w:r>
-              <w:rPr>
-                <w:b w:val="false"/>
-                <w:bCs w:val="false"/>
-              </w:rPr>
-              <w:t xml:space="preserve">Description detaillee du probleme</w:t>
+            <w:r>
+              <w:rPr>
+                <w:b w:val="false"/>
+                <w:bCs w:val="false"/>
+              </w:rPr>
+              <w:t xml:space="preserve">Description détaillée du problème</w:t>
             </w:r>
           </w:p>
         </w:tc>
@@ -1379,9 +1271,6 @@
             <w:tcW w:type="dxa" w:w="3000"/>
           </w:tcPr>
           <w:p>
-            <w:pPr>
-              <w:jc w:val="left"/>
-            </w:pPr>
             <w:r>
               <w:rPr>
                 <w:b w:val="false"/>
@@ -1396,9 +1285,6 @@
             <w:tcW w:type="dxa" w:w="2500"/>
           </w:tcPr>
           <w:p>
-            <w:pPr>
-              <w:jc w:val="left"/>
-            </w:pPr>
             <w:r>
               <w:rPr>
                 <w:b w:val="false"/>
@@ -1413,15 +1299,12 @@
             <w:tcW w:type="dxa" w:w="5300"/>
           </w:tcPr>
           <w:p>
-            <w:pPr>
-              <w:jc w:val="left"/>
-            </w:pPr>
-            <w:r>
-              <w:rPr>
-                <w:b w:val="false"/>
-                <w:bCs w:val="false"/>
-              </w:rPr>
-              <w:t xml:space="preserve">Quartier concerne par le probleme</w:t>
+            <w:r>
+              <w:rPr>
+                <w:b w:val="false"/>
+                <w:bCs w:val="false"/>
+              </w:rPr>
+              <w:t xml:space="preserve">Quartier concerné par le problème</w:t>
             </w:r>
           </w:p>
         </w:tc>
@@ -1432,9 +1315,6 @@
             <w:tcW w:type="dxa" w:w="3000"/>
           </w:tcPr>
           <w:p>
-            <w:pPr>
-              <w:jc w:val="left"/>
-            </w:pPr>
             <w:r>
               <w:rPr>
                 <w:b w:val="false"/>
@@ -1449,9 +1329,6 @@
             <w:tcW w:type="dxa" w:w="2500"/>
           </w:tcPr>
           <w:p>
-            <w:pPr>
-              <w:jc w:val="left"/>
-            </w:pPr>
             <w:r>
               <w:rPr>
                 <w:b w:val="false"/>
@@ -1466,9 +1343,6 @@
             <w:tcW w:type="dxa" w:w="5300"/>
           </w:tcPr>
           <w:p>
-            <w:pPr>
-              <w:jc w:val="left"/>
-            </w:pPr>
             <w:r>
               <w:rPr>
                 <w:b w:val="false"/>
@@ -1485,9 +1359,6 @@
             <w:tcW w:type="dxa" w:w="3000"/>
           </w:tcPr>
           <w:p>
-            <w:pPr>
-              <w:jc w:val="left"/>
-            </w:pPr>
             <w:r>
               <w:rPr>
                 <w:b w:val="false"/>
@@ -1502,9 +1373,6 @@
             <w:tcW w:type="dxa" w:w="2500"/>
           </w:tcPr>
           <w:p>
-            <w:pPr>
-              <w:jc w:val="left"/>
-            </w:pPr>
             <w:r>
               <w:rPr>
                 <w:b w:val="false"/>
@@ -1519,15 +1387,12 @@
             <w:tcW w:type="dxa" w:w="5300"/>
           </w:tcPr>
           <w:p>
-            <w:pPr>
-              <w:jc w:val="left"/>
-            </w:pPr>
-            <w:r>
-              <w:rPr>
-                <w:b w:val="false"/>
-                <w:bCs w:val="false"/>
-              </w:rPr>
-              <w:t xml:space="preserve">nouveau, en_cours, resolu ou rejete (nouveau par defaut)</w:t>
+            <w:r>
+              <w:rPr>
+                <w:b w:val="false"/>
+                <w:bCs w:val="false"/>
+              </w:rPr>
+              <w:t xml:space="preserve">nouveau, en_cours, resolu ou rejete (nouveau par défaut)</w:t>
             </w:r>
           </w:p>
         </w:tc>
@@ -1569,9 +1434,6 @@
             <w:shd w:fill="D9E2F3" w:val="clear"/>
           </w:tcPr>
           <w:p>
-            <w:pPr>
-              <w:jc w:val="left"/>
-            </w:pPr>
             <w:r>
               <w:rPr>
                 <w:b/>
@@ -1587,9 +1449,6 @@
             <w:shd w:fill="D9E2F3" w:val="clear"/>
           </w:tcPr>
           <w:p>
-            <w:pPr>
-              <w:jc w:val="left"/>
-            </w:pPr>
             <w:r>
               <w:rPr>
                 <w:b/>
@@ -1605,9 +1464,6 @@
             <w:shd w:fill="D9E2F3" w:val="clear"/>
           </w:tcPr>
           <w:p>
-            <w:pPr>
-              <w:jc w:val="left"/>
-            </w:pPr>
             <w:r>
               <w:rPr>
                 <w:b/>
@@ -1624,9 +1480,6 @@
             <w:tcW w:type="dxa" w:w="3000"/>
           </w:tcPr>
           <w:p>
-            <w:pPr>
-              <w:jc w:val="left"/>
-            </w:pPr>
             <w:r>
               <w:rPr>
                 <w:b w:val="false"/>
@@ -1641,9 +1494,6 @@
             <w:tcW w:type="dxa" w:w="2500"/>
           </w:tcPr>
           <w:p>
-            <w:pPr>
-              <w:jc w:val="left"/>
-            </w:pPr>
             <w:r>
               <w:rPr>
                 <w:b w:val="false"/>
@@ -1658,15 +1508,12 @@
             <w:tcW w:type="dxa" w:w="5300"/>
           </w:tcPr>
           <w:p>
-            <w:pPr>
-              <w:jc w:val="left"/>
-            </w:pPr>
-            <w:r>
-              <w:rPr>
-                <w:b w:val="false"/>
-                <w:bCs w:val="false"/>
-              </w:rPr>
-              <w:t xml:space="preserve">Signalement concerne</w:t>
+            <w:r>
+              <w:rPr>
+                <w:b w:val="false"/>
+                <w:bCs w:val="false"/>
+              </w:rPr>
+              <w:t xml:space="preserve">Signalement concerné</w:t>
             </w:r>
           </w:p>
         </w:tc>
@@ -1677,9 +1524,6 @@
             <w:tcW w:type="dxa" w:w="3000"/>
           </w:tcPr>
           <w:p>
-            <w:pPr>
-              <w:jc w:val="left"/>
-            </w:pPr>
             <w:r>
               <w:rPr>
                 <w:b w:val="false"/>
@@ -1694,9 +1538,6 @@
             <w:tcW w:type="dxa" w:w="2500"/>
           </w:tcPr>
           <w:p>
-            <w:pPr>
-              <w:jc w:val="left"/>
-            </w:pPr>
             <w:r>
               <w:rPr>
                 <w:b w:val="false"/>
@@ -1711,15 +1552,12 @@
             <w:tcW w:type="dxa" w:w="5300"/>
           </w:tcPr>
           <w:p>
-            <w:pPr>
-              <w:jc w:val="left"/>
-            </w:pPr>
-            <w:r>
-              <w:rPr>
-                <w:b w:val="false"/>
-                <w:bCs w:val="false"/>
-              </w:rPr>
-              <w:t xml:space="preserve">Agent ayant realise l'intervention</w:t>
+            <w:r>
+              <w:rPr>
+                <w:b w:val="false"/>
+                <w:bCs w:val="false"/>
+              </w:rPr>
+              <w:t xml:space="preserve">Agent ayant réalisé l'intervention</w:t>
             </w:r>
           </w:p>
         </w:tc>
@@ -1730,9 +1568,6 @@
             <w:tcW w:type="dxa" w:w="3000"/>
           </w:tcPr>
           <w:p>
-            <w:pPr>
-              <w:jc w:val="left"/>
-            </w:pPr>
             <w:r>
               <w:rPr>
                 <w:b w:val="false"/>
@@ -1747,9 +1582,6 @@
             <w:tcW w:type="dxa" w:w="2500"/>
           </w:tcPr>
           <w:p>
-            <w:pPr>
-              <w:jc w:val="left"/>
-            </w:pPr>
             <w:r>
               <w:rPr>
                 <w:b w:val="false"/>
@@ -1764,9 +1596,6 @@
             <w:tcW w:type="dxa" w:w="5300"/>
           </w:tcPr>
           <w:p>
-            <w:pPr>
-              <w:jc w:val="left"/>
-            </w:pPr>
             <w:r>
               <w:rPr>
                 <w:b w:val="false"/>
@@ -1783,9 +1612,6 @@
             <w:tcW w:type="dxa" w:w="3000"/>
           </w:tcPr>
           <w:p>
-            <w:pPr>
-              <w:jc w:val="left"/>
-            </w:pPr>
             <w:r>
               <w:rPr>
                 <w:b w:val="false"/>
@@ -1800,9 +1626,6 @@
             <w:tcW w:type="dxa" w:w="2500"/>
           </w:tcPr>
           <w:p>
-            <w:pPr>
-              <w:jc w:val="left"/>
-            </w:pPr>
             <w:r>
               <w:rPr>
                 <w:b w:val="false"/>
@@ -1817,15 +1640,12 @@
             <w:tcW w:type="dxa" w:w="5300"/>
           </w:tcPr>
           <w:p>
-            <w:pPr>
-              <w:jc w:val="left"/>
-            </w:pPr>
-            <w:r>
-              <w:rPr>
-                <w:b w:val="false"/>
-                <w:bCs w:val="false"/>
-              </w:rPr>
-              <w:t xml:space="preserve">Statut apres l'intervention</w:t>
+            <w:r>
+              <w:rPr>
+                <w:b w:val="false"/>
+                <w:bCs w:val="false"/>
+              </w:rPr>
+              <w:t xml:space="preserve">Statut après l'intervention</w:t>
             </w:r>
           </w:p>
         </w:tc>
@@ -1836,9 +1656,6 @@
             <w:tcW w:type="dxa" w:w="3000"/>
           </w:tcPr>
           <w:p>
-            <w:pPr>
-              <w:jc w:val="left"/>
-            </w:pPr>
             <w:r>
               <w:rPr>
                 <w:b w:val="false"/>
@@ -1853,9 +1670,6 @@
             <w:tcW w:type="dxa" w:w="2500"/>
           </w:tcPr>
           <w:p>
-            <w:pPr>
-              <w:jc w:val="left"/>
-            </w:pPr>
             <w:r>
               <w:rPr>
                 <w:b w:val="false"/>
@@ -1870,9 +1684,6 @@
             <w:tcW w:type="dxa" w:w="5300"/>
           </w:tcPr>
           <w:p>
-            <w:pPr>
-              <w:jc w:val="left"/>
-            </w:pPr>
             <w:r>
               <w:rPr>
                 <w:b w:val="false"/>
@@ -1920,9 +1731,6 @@
             <w:shd w:fill="D9E2F3" w:val="clear"/>
           </w:tcPr>
           <w:p>
-            <w:pPr>
-              <w:jc w:val="left"/>
-            </w:pPr>
             <w:r>
               <w:rPr>
                 <w:b/>
@@ -1938,9 +1746,6 @@
             <w:shd w:fill="D9E2F3" w:val="clear"/>
           </w:tcPr>
           <w:p>
-            <w:pPr>
-              <w:jc w:val="left"/>
-            </w:pPr>
             <w:r>
               <w:rPr>
                 <w:b/>
@@ -1956,9 +1761,6 @@
             <w:shd w:fill="D9E2F3" w:val="clear"/>
           </w:tcPr>
           <w:p>
-            <w:pPr>
-              <w:jc w:val="left"/>
-            </w:pPr>
             <w:r>
               <w:rPr>
                 <w:b/>
@@ -1975,9 +1777,6 @@
             <w:tcW w:type="dxa" w:w="3000"/>
           </w:tcPr>
           <w:p>
-            <w:pPr>
-              <w:jc w:val="left"/>
-            </w:pPr>
             <w:r>
               <w:rPr>
                 <w:b w:val="false"/>
@@ -1992,9 +1791,6 @@
             <w:tcW w:type="dxa" w:w="2500"/>
           </w:tcPr>
           <w:p>
-            <w:pPr>
-              <w:jc w:val="left"/>
-            </w:pPr>
             <w:r>
               <w:rPr>
                 <w:b w:val="false"/>
@@ -2009,9 +1805,6 @@
             <w:tcW w:type="dxa" w:w="5300"/>
           </w:tcPr>
           <w:p>
-            <w:pPr>
-              <w:jc w:val="left"/>
-            </w:pPr>
             <w:r>
               <w:rPr>
                 <w:b w:val="false"/>
@@ -2028,9 +1821,6 @@
             <w:tcW w:type="dxa" w:w="3000"/>
           </w:tcPr>
           <w:p>
-            <w:pPr>
-              <w:jc w:val="left"/>
-            </w:pPr>
             <w:r>
               <w:rPr>
                 <w:b w:val="false"/>
@@ -2045,9 +1835,6 @@
             <w:tcW w:type="dxa" w:w="2500"/>
           </w:tcPr>
           <w:p>
-            <w:pPr>
-              <w:jc w:val="left"/>
-            </w:pPr>
             <w:r>
               <w:rPr>
                 <w:b w:val="false"/>
@@ -2062,15 +1849,12 @@
             <w:tcW w:type="dxa" w:w="5300"/>
           </w:tcPr>
           <w:p>
-            <w:pPr>
-              <w:jc w:val="left"/>
-            </w:pPr>
-            <w:r>
-              <w:rPr>
-                <w:b w:val="false"/>
-                <w:bCs w:val="false"/>
-              </w:rPr>
-              <w:t xml:space="preserve">Signalement concerne</w:t>
+            <w:r>
+              <w:rPr>
+                <w:b w:val="false"/>
+                <w:bCs w:val="false"/>
+              </w:rPr>
+              <w:t xml:space="preserve">Signalement concerné</w:t>
             </w:r>
           </w:p>
         </w:tc>
@@ -2081,9 +1865,6 @@
             <w:tcW w:type="dxa" w:w="3000"/>
           </w:tcPr>
           <w:p>
-            <w:pPr>
-              <w:jc w:val="left"/>
-            </w:pPr>
             <w:r>
               <w:rPr>
                 <w:b w:val="false"/>
@@ -2098,9 +1879,6 @@
             <w:tcW w:type="dxa" w:w="2500"/>
           </w:tcPr>
           <w:p>
-            <w:pPr>
-              <w:jc w:val="left"/>
-            </w:pPr>
             <w:r>
               <w:rPr>
                 <w:b w:val="false"/>
@@ -2115,9 +1893,6 @@
             <w:tcW w:type="dxa" w:w="5300"/>
           </w:tcPr>
           <w:p>
-            <w:pPr>
-              <w:jc w:val="left"/>
-            </w:pPr>
             <w:r>
               <w:rPr>
                 <w:b w:val="false"/>
@@ -2134,9 +1909,6 @@
             <w:tcW w:type="dxa" w:w="3000"/>
           </w:tcPr>
           <w:p>
-            <w:pPr>
-              <w:jc w:val="left"/>
-            </w:pPr>
             <w:r>
               <w:rPr>
                 <w:b w:val="false"/>
@@ -2151,9 +1923,6 @@
             <w:tcW w:type="dxa" w:w="2500"/>
           </w:tcPr>
           <w:p>
-            <w:pPr>
-              <w:jc w:val="left"/>
-            </w:pPr>
             <w:r>
               <w:rPr>
                 <w:b w:val="false"/>
@@ -2168,15 +1937,12 @@
             <w:tcW w:type="dxa" w:w="5300"/>
           </w:tcPr>
           <w:p>
-            <w:pPr>
-              <w:jc w:val="left"/>
-            </w:pPr>
-            <w:r>
-              <w:rPr>
-                <w:b w:val="false"/>
-                <w:bCs w:val="false"/>
-              </w:rPr>
-              <w:t xml:space="preserve">Indique si la notification a ete lue (faux par defaut)</w:t>
+            <w:r>
+              <w:rPr>
+                <w:b w:val="false"/>
+                <w:bCs w:val="false"/>
+              </w:rPr>
+              <w:t xml:space="preserve">Indique si la notification a été lue (faux par défaut)</w:t>
             </w:r>
           </w:p>
         </w:tc>
@@ -2188,46 +1954,46 @@
         <w:spacing w:after="100" w:before="200"/>
       </w:pPr>
       <w:r>
-        <w:t xml:space="preserve">Relations entre les entites</w:t>
-      </w:r>
-    </w:p>
-    <w:p>
-      <w:pPr>
-        <w:pStyle w:val="ListParagraph"/>
-        <w:numPr>
-          <w:ilvl w:val="0"/>
-          <w:numId w:val="2"/>
-        </w:numPr>
-        <w:spacing w:after="60"/>
-      </w:pPr>
-      <w:r>
-        <w:t xml:space="preserve">Un utilisateur (citoyen) peut creer plusieurs signalements ; un signalement appartient a un seul citoyen.</w:t>
-      </w:r>
-    </w:p>
-    <w:p>
-      <w:pPr>
-        <w:pStyle w:val="ListParagraph"/>
-        <w:numPr>
-          <w:ilvl w:val="0"/>
-          <w:numId w:val="2"/>
-        </w:numPr>
-        <w:spacing w:after="60"/>
-      </w:pPr>
-      <w:r>
-        <w:t xml:space="preserve">Un signalement peut avoir plusieurs interventions ; une intervention appartient a un signalement et a l'agent qui l'a realisee.</w:t>
-      </w:r>
-    </w:p>
-    <w:p>
-      <w:pPr>
-        <w:pStyle w:val="ListParagraph"/>
-        <w:numPr>
-          <w:ilvl w:val="0"/>
-          <w:numId w:val="2"/>
-        </w:numPr>
-        <w:spacing w:after="60"/>
-      </w:pPr>
-      <w:r>
-        <w:t xml:space="preserve">Un utilisateur peut recevoir plusieurs notifications ; une notification appartient a un utilisateur et concerne un signalement.</w:t>
+        <w:t xml:space="preserve">Relations entre les entités</w:t>
+      </w:r>
+    </w:p>
+    <w:p>
+      <w:pPr>
+        <w:pStyle w:val="ListParagraph"/>
+        <w:numPr>
+          <w:ilvl w:val="0"/>
+          <w:numId w:val="2"/>
+        </w:numPr>
+        <w:spacing w:after="60"/>
+      </w:pPr>
+      <w:r>
+        <w:t xml:space="preserve">Un utilisateur (citoyen) peut créer plusieurs signalements ; un signalement appartient à un seul citoyen.</w:t>
+      </w:r>
+    </w:p>
+    <w:p>
+      <w:pPr>
+        <w:pStyle w:val="ListParagraph"/>
+        <w:numPr>
+          <w:ilvl w:val="0"/>
+          <w:numId w:val="2"/>
+        </w:numPr>
+        <w:spacing w:after="60"/>
+      </w:pPr>
+      <w:r>
+        <w:t xml:space="preserve">Un signalement peut avoir plusieurs interventions ; une intervention appartient à un signalement et à l'agent qui l'a réalisée.</w:t>
+      </w:r>
+    </w:p>
+    <w:p>
+      <w:pPr>
+        <w:pStyle w:val="ListParagraph"/>
+        <w:numPr>
+          <w:ilvl w:val="0"/>
+          <w:numId w:val="2"/>
+        </w:numPr>
+        <w:spacing w:after="60"/>
+      </w:pPr>
+      <w:r>
+        <w:t xml:space="preserve">Un utilisateur peut recevoir plusieurs notifications ; une notification appartient à un utilisateur et concerne un signalement.</w:t>
       </w:r>
     </w:p>
     <w:p>
@@ -2251,7 +2017,7 @@
         <w:t xml:space="preserve">Performance : </w:t>
       </w:r>
       <w:r>
-        <w:t xml:space="preserve">les listes de signalements sont paginees, les relations sont chargees par anticipation pour eviter les requetes repetees, et les images sont redimensionnees avant l'envoi.</w:t>
+        <w:t xml:space="preserve">les listes de signalements sont paginées, les relations sont chargées par anticipation pour éviter les requêtes répétées, et les images sont redimensionnées avant l'envoi.</w:t>
       </w:r>
     </w:p>
     <w:p>
@@ -2263,10 +2029,10 @@
           <w:b/>
           <w:bCs/>
         </w:rPr>
-        <w:t xml:space="preserve">Securite : </w:t>
-      </w:r>
-      <w:r>
-        <w:t xml:space="preserve">authentification par token avec Laravel Sanctum, mots de passe haches, validation systematique des donnees cote serveur, autorisation par role (policies Laravel) et protection contre les failles courantes grace a l'ORM Eloquent et a l'echappement automatique de React.</w:t>
+        <w:t xml:space="preserve">Sécurité : </w:t>
+      </w:r>
+      <w:r>
+        <w:t xml:space="preserve">authentification par token avec Laravel Sanctum, mots de passe hachés, validation systématique des données côté serveur, autorisation par rôle (policies Laravel) et protection contre les failles courantes grâce à l'ORM Eloquent et à l'échappement automatique de React.</w:t>
       </w:r>
     </w:p>
     <w:p>
@@ -2278,10 +2044,10 @@
           <w:b/>
           <w:bCs/>
         </w:rPr>
-        <w:t xml:space="preserve">Convivialite et ergonomie : </w:t>
-      </w:r>
-      <w:r>
-        <w:t xml:space="preserve">interface simple, en francais, avec un vocabulaire proche du quotidien des utilisateurs. Formulaires courts, messages d'erreur clairs et explicites.</w:t>
+        <w:t xml:space="preserve">Convivialité et ergonomie : </w:t>
+      </w:r>
+      <w:r>
+        <w:t xml:space="preserve">interface simple, en français, avec un vocabulaire proche du quotidien des utilisateurs. Formulaires courts, messages d'erreur clairs et explicites.</w:t>
       </w:r>
     </w:p>
     <w:p>
@@ -2293,10 +2059,10 @@
           <w:b/>
           <w:bCs/>
         </w:rPr>
-        <w:t xml:space="preserve">Compatibilite : </w:t>
-      </w:r>
-      <w:r>
-        <w:t xml:space="preserve">application responsive, utilisable sur mobile, tablette et ordinateur, compatible avec les navigateurs recents (Chrome, Firefox, Edge).</w:t>
+        <w:t xml:space="preserve">Compatibilité : </w:t>
+      </w:r>
+      <w:r>
+        <w:t xml:space="preserve">application responsive, utilisable sur mobile, tablette et ordinateur, compatible avec les navigateurs récents (Chrome, Firefox, Edge).</w:t>
       </w:r>
     </w:p>
     <w:p>
@@ -2308,7 +2074,7 @@
           <w:b/>
           <w:bCs/>
         </w:rPr>
-        <w:t xml:space="preserve">Accessibilite : </w:t>
+        <w:t xml:space="preserve">Accessibilité : </w:t>
       </w:r>
       <w:r>
         <w:t xml:space="preserve">contrastes suffisants, textes alternatifs pour les images, navigation possible au clavier et tailles de police lisibles.</w:t>
@@ -2323,10 +2089,10 @@
           <w:b/>
           <w:bCs/>
         </w:rPr>
-        <w:t xml:space="preserve">Eco-responsabilite : </w:t>
-      </w:r>
-      <w:r>
-        <w:t xml:space="preserve">compte tenu d'une connectivite parfois limitee en Haiti, l'application privilegie des pages legeres, un nombre reduit de requetes, des images compressees et un minimum de dependances externes.</w:t>
+        <w:t xml:space="preserve">Éco-responsabilité : </w:t>
+      </w:r>
+      <w:r>
+        <w:t xml:space="preserve">compte tenu d'une connectivité parfois limitée en Haïti, l'application privilégie des pages légères, un nombre réduit de requêtes, des images compressées et un minimum de dépendances externes.</w:t>
       </w:r>
     </w:p>
     <w:p>
@@ -2343,7 +2109,7 @@
         <w:spacing w:after="120"/>
       </w:pPr>
       <w:r>
-        <w:t xml:space="preserve">Architecture de type client serveur : une application monopage (SPA) en React communique avec une API REST Laravel via des requetes HTTP au format JSON.</w:t>
+        <w:t xml:space="preserve">Architecture de type client-serveur : une application monopage (SPA) en React communique avec une API REST Laravel via des requêtes HTTP au format JSON.</w:t>
       </w:r>
     </w:p>
     <w:p>
@@ -2358,7 +2124,7 @@
         <w:t xml:space="preserve">Front-end : </w:t>
       </w:r>
       <w:r>
-        <w:t xml:space="preserve">React, react-router-dom pour la navigation, Context API pour la gestion de l'etat d'authentification, Axios pour les appels HTTP.</w:t>
+        <w:t xml:space="preserve">React, react-router-dom pour la navigation, Context API pour la gestion de l'état d'authentification, Axios pour les appels HTTP.</w:t>
       </w:r>
     </w:p>
     <w:p>
@@ -2373,7 +2139,7 @@
         <w:t xml:space="preserve">Back-end : </w:t>
       </w:r>
       <w:r>
-        <w:t xml:space="preserve">Laravel, Laravel Sanctum pour l'authentification par token, base de donnees SQLite pour la simplicite d'installation et de test.</w:t>
+        <w:t xml:space="preserve">Laravel, Laravel Sanctum pour l'authentification par token, base de données SQLite pour la simplicité d'installation et de test.</w:t>
       </w:r>
     </w:p>
     <w:p>
@@ -2385,10 +2151,10 @@
           <w:b/>
           <w:bCs/>
         </w:rPr>
-        <w:t xml:space="preserve">Environnement de developpement : </w:t>
-      </w:r>
-      <w:r>
-        <w:t xml:space="preserve">serveur Laravel lance avec artisan serve, serveur de developpement Vite pour React, PHP et Composer fournis localement par Laragon ou XAMPP.</w:t>
+        <w:t xml:space="preserve">Environnement de développement : </w:t>
+      </w:r>
+      <w:r>
+        <w:t xml:space="preserve">serveur Laravel lancé avec artisan serve, serveur de développement Vite pour React, PHP et Composer fournis localement par Laragon ou XAMPP.</w:t>
       </w:r>
     </w:p>
     <w:p>
@@ -2397,7 +2163,7 @@
         <w:spacing w:after="150" w:before="300"/>
       </w:pPr>
       <w:r>
-        <w:t xml:space="preserve">8. Interface utilisateur et experience utilisateur</w:t>
+        <w:t xml:space="preserve">8. Interface utilisateur et expérience utilisateur</w:t>
       </w:r>
     </w:p>
     <w:p>
@@ -2405,7 +2171,7 @@
         <w:spacing w:after="120"/>
       </w:pPr>
       <w:r>
-        <w:t xml:space="preserve">Style visuel sobre et clair, avec des couleurs inspirees du drapeau haitien (bleu et rouge) sur un fond neutre pour garder une bonne lisibilite. Typographie simple. Navigation par menu principal avec acces direct a Signaler un probleme, Mes signalements et, pour l'agent, Tableau de bord.</w:t>
+        <w:t xml:space="preserve">Style visuel sobre et clair, avec des couleurs inspirées du drapeau haïtien (bleu et rouge) sur un fond neutre pour garder une bonne lisibilité. Typographie simple. Navigation par menu principal avec accès direct à Signaler un problème, Mes signalements et, pour l'agent, Tableau de bord.</w:t>
       </w:r>
     </w:p>
     <w:p>
@@ -2413,7 +2179,7 @@
         <w:spacing w:after="120"/>
       </w:pPr>
       <w:r>
-        <w:t xml:space="preserve">Composants reutilisables prevus : carte de signalement, badge de statut colore, formulaire de signalement, barre de navigation, ligne du temps des interventions.</w:t>
+        <w:t xml:space="preserve">Composants réutilisables prévus : carte de signalement, badge de statut coloré, formulaire de signalement, barre de navigation, ligne du temps des interventions.</w:t>
       </w:r>
     </w:p>
     <w:p>
@@ -2431,7 +2197,7 @@
         <w:spacing w:after="100" w:before="200"/>
       </w:pPr>
       <w:r>
-        <w:t xml:space="preserve">Scenario : signaler un probleme</w:t>
+        <w:t xml:space="preserve">Scénario : signaler un problème</w:t>
       </w:r>
     </w:p>
     <w:p>
@@ -2439,7 +2205,7 @@
         <w:spacing w:after="120"/>
       </w:pPr>
       <w:r>
-        <w:t xml:space="preserve">Le citoyen se connecte, clique sur Nouveau signalement, remplit le formulaire (categorie, titre, description, quartier, photo facultative), clique sur Envoyer, puis est redirige vers la page de detail du signalement cree avec le statut nouveau.</w:t>
+        <w:t xml:space="preserve">Le citoyen se connecte, clique sur Nouveau signalement, remplit le formulaire (catégorie, titre, description, quartier, photo facultative), clique sur Envoyer, puis est redirigé vers la page de détail du signalement créé avec le statut nouveau.</w:t>
       </w:r>
     </w:p>
     <w:p>
@@ -2448,7 +2214,7 @@
         <w:spacing w:after="100" w:before="200"/>
       </w:pPr>
       <w:r>
-        <w:t xml:space="preserve">Scenario : suivre un signalement</w:t>
+        <w:t xml:space="preserve">Scénario : suivre un signalement</w:t>
       </w:r>
     </w:p>
     <w:p>
@@ -2456,7 +2222,7 @@
         <w:spacing w:after="120"/>
       </w:pPr>
       <w:r>
-        <w:t xml:space="preserve">Le citoyen se connecte, ouvre Mes signalements, selectionne un signalement, consulte son statut actuel et l'historique des interventions, et voit apparaitre une notification si le statut a change.</w:t>
+        <w:t xml:space="preserve">Le citoyen se connecte, ouvre Mes signalements, sélectionne un signalement, consulte son statut actuel et l'historique des interventions, et voit apparaître une notification si le statut a changé.</w:t>
       </w:r>
     </w:p>
     <w:p>
@@ -2465,7 +2231,7 @@
         <w:spacing w:after="100" w:before="200"/>
       </w:pPr>
       <w:r>
-        <w:t xml:space="preserve">Scenario : traiter un signalement (agent)</w:t>
+        <w:t xml:space="preserve">Scénario : traiter un signalement (agent)</w:t>
       </w:r>
     </w:p>
     <w:p>
@@ -2473,7 +2239,7 @@
         <w:spacing w:after="120"/>
       </w:pPr>
       <w:r>
-        <w:t xml:space="preserve">L'agent se connecte, consulte la liste de tous les signalements, filtre par statut nouveau, ouvre un signalement, ajoute une intervention avec un commentaire et change le statut en en cours ou en resolu. Une notification est alors envoyee au citoyen concerne.</w:t>
+        <w:t xml:space="preserve">L'agent se connecte, consulte la liste de tous les signalements, filtre par statut nouveau, ouvre un signalement, ajoute une intervention avec un commentaire et change le statut en en cours ou en résolu. Une notification est alors envoyée au citoyen concerné.</w:t>
       </w:r>
     </w:p>
     <w:p>
@@ -2482,7 +2248,7 @@
         <w:spacing w:after="150" w:before="300"/>
       </w:pPr>
       <w:r>
-        <w:t xml:space="preserve">10. Echeancier et plan de travail</w:t>
+        <w:t xml:space="preserve">10. Échéancier et plan de travail</w:t>
       </w:r>
     </w:p>
     <w:tbl>
@@ -2511,15 +2277,12 @@
             <w:shd w:fill="D9E2F3" w:val="clear"/>
           </w:tcPr>
           <w:p>
-            <w:pPr>
-              <w:jc w:val="left"/>
-            </w:pPr>
             <w:r>
               <w:rPr>
                 <w:b/>
                 <w:bCs/>
               </w:rPr>
-              <w:t xml:space="preserve">Periode</w:t>
+              <w:t xml:space="preserve">Période</w:t>
             </w:r>
           </w:p>
         </w:tc>
@@ -2529,28 +2292,22 @@
             <w:shd w:fill="D9E2F3" w:val="clear"/>
           </w:tcPr>
           <w:p>
-            <w:pPr>
-              <w:jc w:val="left"/>
-            </w:pPr>
             <w:r>
               <w:rPr>
                 <w:b/>
                 <w:bCs/>
               </w:rPr>
-              <w:t xml:space="preserve">Travail prevu</w:t>
-            </w:r>
-          </w:p>
-        </w:tc>
-      </w:tr>
-      <w:tr>
-        <w:tc>
-          <w:tcPr>
-            <w:tcW w:type="dxa" w:w="2500"/>
-          </w:tcPr>
-          <w:p>
-            <w:pPr>
-              <w:jc w:val="left"/>
-            </w:pPr>
+              <w:t xml:space="preserve">Travail prévu</w:t>
+            </w:r>
+          </w:p>
+        </w:tc>
+      </w:tr>
+      <w:tr>
+        <w:tc>
+          <w:tcPr>
+            <w:tcW w:type="dxa" w:w="2500"/>
+          </w:tcPr>
+          <w:p>
             <w:r>
               <w:rPr>
                 <w:b w:val="false"/>
@@ -2565,9 +2322,6 @@
             <w:tcW w:type="dxa" w:w="7800"/>
           </w:tcPr>
           <w:p>
-            <w:pPr>
-              <w:jc w:val="left"/>
-            </w:pPr>
             <w:r>
               <w:rPr>
                 <w:b w:val="false"/>
@@ -2584,9 +2338,6 @@
             <w:tcW w:type="dxa" w:w="2500"/>
           </w:tcPr>
           <w:p>
-            <w:pPr>
-              <w:jc w:val="left"/>
-            </w:pPr>
             <w:r>
               <w:rPr>
                 <w:b w:val="false"/>
@@ -2601,28 +2352,22 @@
             <w:tcW w:type="dxa" w:w="7800"/>
           </w:tcPr>
           <w:p>
-            <w:pPr>
-              <w:jc w:val="left"/>
-            </w:pPr>
-            <w:r>
-              <w:rPr>
-                <w:b w:val="false"/>
-                <w:bCs w:val="false"/>
-              </w:rPr>
-              <w:t xml:space="preserve">Redaction du cahier des charges (ce document).</w:t>
-            </w:r>
-          </w:p>
-        </w:tc>
-      </w:tr>
-      <w:tr>
-        <w:tc>
-          <w:tcPr>
-            <w:tcW w:type="dxa" w:w="2500"/>
-          </w:tcPr>
-          <w:p>
-            <w:pPr>
-              <w:jc w:val="left"/>
-            </w:pPr>
+            <w:r>
+              <w:rPr>
+                <w:b w:val="false"/>
+                <w:bCs w:val="false"/>
+              </w:rPr>
+              <w:t xml:space="preserve">Rédaction du cahier des charges (ce document).</w:t>
+            </w:r>
+          </w:p>
+        </w:tc>
+      </w:tr>
+      <w:tr>
+        <w:tc>
+          <w:tcPr>
+            <w:tcW w:type="dxa" w:w="2500"/>
+          </w:tcPr>
+          <w:p>
             <w:r>
               <w:rPr>
                 <w:b w:val="false"/>
@@ -2637,9 +2382,6 @@
             <w:tcW w:type="dxa" w:w="7800"/>
           </w:tcPr>
           <w:p>
-            <w:pPr>
-              <w:jc w:val="left"/>
-            </w:pPr>
             <w:r>
               <w:rPr>
                 <w:b w:val="false"/>
@@ -2656,9 +2398,6 @@
             <w:tcW w:type="dxa" w:w="2500"/>
           </w:tcPr>
           <w:p>
-            <w:pPr>
-              <w:jc w:val="left"/>
-            </w:pPr>
             <w:r>
               <w:rPr>
                 <w:b w:val="false"/>
@@ -2673,28 +2412,22 @@
             <w:tcW w:type="dxa" w:w="7800"/>
           </w:tcPr>
           <w:p>
-            <w:pPr>
-              <w:jc w:val="left"/>
-            </w:pPr>
-            <w:r>
-              <w:rPr>
-                <w:b w:val="false"/>
-                <w:bCs w:val="false"/>
-              </w:rPr>
-              <w:t xml:space="preserve">Conception visuelle et conception technique : ecrans, modele de donnees, API, architecture.</w:t>
-            </w:r>
-          </w:p>
-        </w:tc>
-      </w:tr>
-      <w:tr>
-        <w:tc>
-          <w:tcPr>
-            <w:tcW w:type="dxa" w:w="2500"/>
-          </w:tcPr>
-          <w:p>
-            <w:pPr>
-              <w:jc w:val="left"/>
-            </w:pPr>
+            <w:r>
+              <w:rPr>
+                <w:b w:val="false"/>
+                <w:bCs w:val="false"/>
+              </w:rPr>
+              <w:t xml:space="preserve">Conception visuelle et conception technique : écrans, modèle de données, API, architecture.</w:t>
+            </w:r>
+          </w:p>
+        </w:tc>
+      </w:tr>
+      <w:tr>
+        <w:tc>
+          <w:tcPr>
+            <w:tcW w:type="dxa" w:w="2500"/>
+          </w:tcPr>
+          <w:p>
             <w:r>
               <w:rPr>
                 <w:b w:val="false"/>
@@ -2709,28 +2442,22 @@
             <w:tcW w:type="dxa" w:w="7800"/>
           </w:tcPr>
           <w:p>
-            <w:pPr>
-              <w:jc w:val="left"/>
-            </w:pPr>
-            <w:r>
-              <w:rPr>
-                <w:b w:val="false"/>
-                <w:bCs w:val="false"/>
-              </w:rPr>
-              <w:t xml:space="preserve">Developpement front-end React : pages, composants, navigation, appels API.</w:t>
-            </w:r>
-          </w:p>
-        </w:tc>
-      </w:tr>
-      <w:tr>
-        <w:tc>
-          <w:tcPr>
-            <w:tcW w:type="dxa" w:w="2500"/>
-          </w:tcPr>
-          <w:p>
-            <w:pPr>
-              <w:jc w:val="left"/>
-            </w:pPr>
+            <w:r>
+              <w:rPr>
+                <w:b w:val="false"/>
+                <w:bCs w:val="false"/>
+              </w:rPr>
+              <w:t xml:space="preserve">Développement front-end React : pages, composants, navigation, appels API.</w:t>
+            </w:r>
+          </w:p>
+        </w:tc>
+      </w:tr>
+      <w:tr>
+        <w:tc>
+          <w:tcPr>
+            <w:tcW w:type="dxa" w:w="2500"/>
+          </w:tcPr>
+          <w:p>
             <w:r>
               <w:rPr>
                 <w:b w:val="false"/>
@@ -2745,28 +2472,22 @@
             <w:tcW w:type="dxa" w:w="7800"/>
           </w:tcPr>
           <w:p>
-            <w:pPr>
-              <w:jc w:val="left"/>
-            </w:pPr>
-            <w:r>
-              <w:rPr>
-                <w:b w:val="false"/>
-                <w:bCs w:val="false"/>
-              </w:rPr>
-              <w:t xml:space="preserve">Developpement back-end Laravel : migrations, modeles, controleurs, routes API.</w:t>
-            </w:r>
-          </w:p>
-        </w:tc>
-      </w:tr>
-      <w:tr>
-        <w:tc>
-          <w:tcPr>
-            <w:tcW w:type="dxa" w:w="2500"/>
-          </w:tcPr>
-          <w:p>
-            <w:pPr>
-              <w:jc w:val="left"/>
-            </w:pPr>
+            <w:r>
+              <w:rPr>
+                <w:b w:val="false"/>
+                <w:bCs w:val="false"/>
+              </w:rPr>
+              <w:t xml:space="preserve">Développement back-end Laravel : migrations, modèles, contrôleurs, routes API.</w:t>
+            </w:r>
+          </w:p>
+        </w:tc>
+      </w:tr>
+      <w:tr>
+        <w:tc>
+          <w:tcPr>
+            <w:tcW w:type="dxa" w:w="2500"/>
+          </w:tcPr>
+          <w:p>
             <w:r>
               <w:rPr>
                 <w:b w:val="false"/>
@@ -2781,28 +2502,22 @@
             <w:tcW w:type="dxa" w:w="7800"/>
           </w:tcPr>
           <w:p>
-            <w:pPr>
-              <w:jc w:val="left"/>
-            </w:pPr>
-            <w:r>
-              <w:rPr>
-                <w:b w:val="false"/>
-                <w:bCs w:val="false"/>
-              </w:rPr>
-              <w:t xml:space="preserve">Integration front-back : communication API, gestion des erreurs, authentification.</w:t>
-            </w:r>
-          </w:p>
-        </w:tc>
-      </w:tr>
-      <w:tr>
-        <w:tc>
-          <w:tcPr>
-            <w:tcW w:type="dxa" w:w="2500"/>
-          </w:tcPr>
-          <w:p>
-            <w:pPr>
-              <w:jc w:val="left"/>
-            </w:pPr>
+            <w:r>
+              <w:rPr>
+                <w:b w:val="false"/>
+                <w:bCs w:val="false"/>
+              </w:rPr>
+              <w:t xml:space="preserve">Intégration front-back : communication API, gestion des erreurs, authentification.</w:t>
+            </w:r>
+          </w:p>
+        </w:tc>
+      </w:tr>
+      <w:tr>
+        <w:tc>
+          <w:tcPr>
+            <w:tcW w:type="dxa" w:w="2500"/>
+          </w:tcPr>
+          <w:p>
             <w:r>
               <w:rPr>
                 <w:b w:val="false"/>
@@ -2817,28 +2532,22 @@
             <w:tcW w:type="dxa" w:w="7800"/>
           </w:tcPr>
           <w:p>
-            <w:pPr>
-              <w:jc w:val="left"/>
-            </w:pPr>
-            <w:r>
-              <w:rPr>
-                <w:b w:val="false"/>
-                <w:bCs w:val="false"/>
-              </w:rPr>
-              <w:t xml:space="preserve">Tests backend et verifications front-end.</w:t>
-            </w:r>
-          </w:p>
-        </w:tc>
-      </w:tr>
-      <w:tr>
-        <w:tc>
-          <w:tcPr>
-            <w:tcW w:type="dxa" w:w="2500"/>
-          </w:tcPr>
-          <w:p>
-            <w:pPr>
-              <w:jc w:val="left"/>
-            </w:pPr>
+            <w:r>
+              <w:rPr>
+                <w:b w:val="false"/>
+                <w:bCs w:val="false"/>
+              </w:rPr>
+              <w:t xml:space="preserve">Tests backend et vérifications front-end.</w:t>
+            </w:r>
+          </w:p>
+        </w:tc>
+      </w:tr>
+      <w:tr>
+        <w:tc>
+          <w:tcPr>
+            <w:tcW w:type="dxa" w:w="2500"/>
+          </w:tcPr>
+          <w:p>
             <w:r>
               <w:rPr>
                 <w:b w:val="false"/>
@@ -2853,28 +2562,22 @@
             <w:tcW w:type="dxa" w:w="7800"/>
           </w:tcPr>
           <w:p>
-            <w:pPr>
-              <w:jc w:val="left"/>
-            </w:pPr>
-            <w:r>
-              <w:rPr>
-                <w:b w:val="false"/>
-                <w:bCs w:val="false"/>
-              </w:rPr>
-              <w:t xml:space="preserve">Optimisation, securite, performance et eco-responsabilite.</w:t>
-            </w:r>
-          </w:p>
-        </w:tc>
-      </w:tr>
-      <w:tr>
-        <w:tc>
-          <w:tcPr>
-            <w:tcW w:type="dxa" w:w="2500"/>
-          </w:tcPr>
-          <w:p>
-            <w:pPr>
-              <w:jc w:val="left"/>
-            </w:pPr>
+            <w:r>
+              <w:rPr>
+                <w:b w:val="false"/>
+                <w:bCs w:val="false"/>
+              </w:rPr>
+              <w:t xml:space="preserve">Optimisation, sécurité, performance et éco-responsabilité.</w:t>
+            </w:r>
+          </w:p>
+        </w:tc>
+      </w:tr>
+      <w:tr>
+        <w:tc>
+          <w:tcPr>
+            <w:tcW w:type="dxa" w:w="2500"/>
+          </w:tcPr>
+          <w:p>
             <w:r>
               <w:rPr>
                 <w:b w:val="false"/>
@@ -2889,15 +2592,12 @@
             <w:tcW w:type="dxa" w:w="7800"/>
           </w:tcPr>
           <w:p>
-            <w:pPr>
-              <w:jc w:val="left"/>
-            </w:pPr>
-            <w:r>
-              <w:rPr>
-                <w:b w:val="false"/>
-                <w:bCs w:val="false"/>
-              </w:rPr>
-              <w:t xml:space="preserve">Depot GitHub, redaction du rapport final, preparation de la demonstration.</w:t>
+            <w:r>
+              <w:rPr>
+                <w:b w:val="false"/>
+                <w:bCs w:val="false"/>
+              </w:rPr>
+              <w:t xml:space="preserve">Dépôt GitHub, rédaction du rapport final, préparation de la démonstration.</w:t>
             </w:r>
           </w:p>
         </w:tc>
@@ -2922,33 +2622,33 @@
         <w:spacing w:after="60"/>
       </w:pPr>
       <w:r>
-        <w:t xml:space="preserve">Tests backend Laravel avec PHPUnit : inscription, connexion, creation d'un signalement, changement de statut et controle des autorisations selon le role.</w:t>
-      </w:r>
-    </w:p>
-    <w:p>
-      <w:pPr>
-        <w:pStyle w:val="ListParagraph"/>
-        <w:numPr>
-          <w:ilvl w:val="0"/>
-          <w:numId w:val="2"/>
-        </w:numPr>
-        <w:spacing w:after="60"/>
-      </w:pPr>
-      <w:r>
-        <w:t xml:space="preserve">Verifications fonctionnelles cote front : scenarios manuels couvrant l'inscription, la connexion, la creation d'un signalement, le suivi et le tableau de bord.</w:t>
-      </w:r>
-    </w:p>
-    <w:p>
-      <w:pPr>
-        <w:pStyle w:val="ListParagraph"/>
-        <w:numPr>
-          <w:ilvl w:val="0"/>
-          <w:numId w:val="2"/>
-        </w:numPr>
-        <w:spacing w:after="60"/>
-      </w:pPr>
-      <w:r>
-        <w:t xml:space="preserve">Validation du DSF : a la fin du developpement, chaque fonctionnalite listee en section 4 est reliee a un ecran React et a un endpoint Laravel fonctionnel.</w:t>
+        <w:t xml:space="preserve">Tests backend Laravel avec PHPUnit : inscription, connexion, création d'un signalement, changement de statut et contrôle des autorisations selon le rôle.</w:t>
+      </w:r>
+    </w:p>
+    <w:p>
+      <w:pPr>
+        <w:pStyle w:val="ListParagraph"/>
+        <w:numPr>
+          <w:ilvl w:val="0"/>
+          <w:numId w:val="2"/>
+        </w:numPr>
+        <w:spacing w:after="60"/>
+      </w:pPr>
+      <w:r>
+        <w:t xml:space="preserve">Vérifications fonctionnelles côté front : scénarios manuels couvrant l'inscription, la connexion, la création d'un signalement, le suivi et le tableau de bord.</w:t>
+      </w:r>
+    </w:p>
+    <w:p>
+      <w:pPr>
+        <w:pStyle w:val="ListParagraph"/>
+        <w:numPr>
+          <w:ilvl w:val="0"/>
+          <w:numId w:val="2"/>
+        </w:numPr>
+        <w:spacing w:after="60"/>
+      </w:pPr>
+      <w:r>
+        <w:t xml:space="preserve">Validation du DSF : à la fin du développement, chaque fonctionnalité listée en section 4 est reliée à un écran React et à un endpoint Laravel fonctionnel.</w:t>
       </w:r>
     </w:p>
     <w:p>
@@ -2957,7 +2657,7 @@
         <w:spacing w:after="150" w:before="300"/>
       </w:pPr>
       <w:r>
-        <w:t xml:space="preserve">12. Deploiement et environnement d'execution</w:t>
+        <w:t xml:space="preserve">12. Déploiement et environnement d'exécution</w:t>
       </w:r>
     </w:p>
     <w:p>
@@ -2965,7 +2665,7 @@
         <w:spacing w:after="120"/>
       </w:pPr>
       <w:r>
-        <w:t xml:space="preserve">Pour la demonstration, l'application est executee localement : le back-end Laravel est lance avec la commande artisan serve, et le front-end React avec npm run dev. La base de donnees SQLite est embarquee dans le projet et ne necessite pas de serveur de base de donnees separe.</w:t>
+        <w:t xml:space="preserve">Pour la démonstration, l'application est exécutée localement : le back-end Laravel est lancé avec la commande artisan serve, et le front-end React avec npm run dev. La base de données SQLite est embarquée dans le projet et ne nécessite pas de serveur de base de données séparé.</w:t>
       </w:r>
     </w:p>
     <w:p>
@@ -2977,7 +2677,7 @@
           <w:b/>
           <w:bCs/>
         </w:rPr>
-        <w:t xml:space="preserve">Prerequis techniques : </w:t>
+        <w:t xml:space="preserve">Prérequis techniques : </w:t>
       </w:r>
       <w:r>
         <w:t xml:space="preserve">PHP 8.3, Composer, Node.js et npm.</w:t>
@@ -2989,7 +2689,7 @@
         <w:spacing w:after="150" w:before="300"/>
       </w:pPr>
       <w:r>
-        <w:t xml:space="preserve">13. References</w:t>
+        <w:t xml:space="preserve">13. Références</w:t>
       </w:r>
     </w:p>
     <w:p>
@@ -3041,7 +2741,7 @@
         <w:spacing w:after="60"/>
       </w:pPr>
       <w:r>
-        <w:t xml:space="preserve">Consignes du cours Developpement Web, niveau approfondi.</w:t>
+        <w:t xml:space="preserve">Consignes du cours Développement Web, niveau approfondi.</w:t>
       </w:r>
     </w:p>
     <w:sectPr>

</xml_diff>